<commit_message>
chore: complete Agentic CRAG rename
</commit_message>
<xml_diff>
--- a/documents/01_product_requirements.docx
+++ b/documents/01_product_requirements.docx
@@ -11,7 +11,7 @@
           <w:b/>
           <w:sz w:val="36"/>
         </w:rPr>
-        <w:t>INSIGHT.AI Product Requirements Document</w:t>
+        <w:t>Agentic CRAG Product Requirements Document</w:t>
       </w:r>
     </w:p>
     <w:p>
@@ -37,7 +37,7 @@
     </w:p>
     <w:p>
       <w:r>
-        <w:t>INSIGHT.AI is a document assistant for retrieval augmented generation over uploaded business documents. The product goal is to let a user upload project material, create a searchable collection, and ask grounded questions with visible source evidence.</w:t>
+        <w:t>Agentic CRAG is a document assistant for retrieval augmented generation over uploaded business documents. The product goal is to let a user upload project material, create a searchable collection, and ask grounded questions with visible source evidence.</w:t>
       </w:r>
     </w:p>
     <w:p>

</xml_diff>